<commit_message>
perf: reach 94.94% overall recall (95.77% person names, 100% DIN, 97.92% email) with 335 applied redactions
</commit_message>
<xml_diff>
--- a/output/Evaluation_Strategy_and_Metrics.docx
+++ b/output/Evaluation_Strategy_and_Metrics.docx
@@ -64,7 +64,7 @@
               <w:br/>
               <w:t>Input Document: KSH International Limited Red Herring Prospectus (1,006 Paras, 76 Tables, 3,991 Blocks)</w:t>
               <w:br/>
-              <w:t>Evaluated Baseline: 178 Ground Truth Annotations   |   Overall Recall: 87.64%   |   F1 Score: 66.10%</w:t>
+              <w:t>Evaluated Baseline: 178 Ground Truth Annotations   |   Overall Recall: 94.94%   |   F1 Score: 65.89%</w:t>
             </w:r>
           </w:p>
         </w:tc>
@@ -96,7 +96,7 @@
         <w:t>This report evaluates the performance of the Enterprise PII Redaction Engine applied to the KSH International Limited IPO Red Herring Prospectus (.docx). The document presents dense tabular layouts (76 tables with 3,722 cells), extensive legal/financial terminology, and repetitive corporate entities that must be distinguished from individual PII.</w:t>
         <w:br/>
         <w:br/>
-        <w:t>The redaction engine successfully detected and replaced 294 PII spans across the document with realistic, format-preserving fake data generated deterministically via Faker. Against 178 manually annotated ground truth spans spanning the densest sections, the engine achieved an Overall Recall of 87.64%, with 100% Precision and Recall on Indian Director Identification Numbers (DIN), 97.92% Recall on Email addresses, and 96.15% Recall on Phone numbers.</w:t>
+        <w:t>The redaction engine successfully detected and replaced 335 PII spans across the document with realistic, format-preserving fake data generated deterministically via Faker. Against 178 manually annotated ground truth spans spanning the densest sections, the engine achieved an Overall Recall of 94.94%, with 100% Precision and Recall on Indian Director Identification Numbers (DIN), 97.92% Recall on Email addresses, 96.15% Recall on Phone numbers, 95.77% Recall on Person Names, and 84.00% Recall on Addresses.</w:t>
       </w:r>
     </w:p>
     <w:p>
@@ -1038,7 +1038,7 @@
                 <w:color w:val="334155"/>
                 <w:sz w:val="17"/>
               </w:rPr>
-              <w:t>57</w:t>
+              <w:t>68</w:t>
             </w:r>
           </w:p>
         </w:tc>
@@ -1062,7 +1062,7 @@
                 <w:color w:val="334155"/>
                 <w:sz w:val="17"/>
               </w:rPr>
-              <w:t>111</w:t>
+              <w:t>115</w:t>
             </w:r>
           </w:p>
         </w:tc>
@@ -1086,7 +1086,7 @@
                 <w:color w:val="334155"/>
                 <w:sz w:val="17"/>
               </w:rPr>
-              <w:t>14</w:t>
+              <w:t>3</w:t>
             </w:r>
           </w:p>
         </w:tc>
@@ -1110,7 +1110,7 @@
                 <w:color w:val="334155"/>
                 <w:sz w:val="17"/>
               </w:rPr>
-              <w:t>33.93%</w:t>
+              <w:t>37.16%</w:t>
             </w:r>
           </w:p>
         </w:tc>
@@ -1134,7 +1134,7 @@
                 <w:color w:val="334155"/>
                 <w:sz w:val="17"/>
               </w:rPr>
-              <w:t>80.28%</w:t>
+              <w:t>95.77%</w:t>
             </w:r>
           </w:p>
         </w:tc>
@@ -1158,7 +1158,7 @@
                 <w:color w:val="334155"/>
                 <w:sz w:val="17"/>
               </w:rPr>
-              <w:t>31.32%</w:t>
+              <w:t>36.56%</w:t>
             </w:r>
           </w:p>
         </w:tc>
@@ -1182,7 +1182,7 @@
                 <w:color w:val="334155"/>
                 <w:sz w:val="17"/>
               </w:rPr>
-              <w:t>47.70%</w:t>
+              <w:t>53.54%</w:t>
             </w:r>
           </w:p>
         </w:tc>
@@ -1232,7 +1232,7 @@
                 <w:color w:val="334155"/>
                 <w:sz w:val="17"/>
               </w:rPr>
-              <w:t>19</w:t>
+              <w:t>21</w:t>
             </w:r>
           </w:p>
         </w:tc>
@@ -1256,7 +1256,7 @@
                 <w:color w:val="334155"/>
                 <w:sz w:val="17"/>
               </w:rPr>
-              <w:t>15</w:t>
+              <w:t>39</w:t>
             </w:r>
           </w:p>
         </w:tc>
@@ -1280,7 +1280,7 @@
                 <w:color w:val="334155"/>
                 <w:sz w:val="17"/>
               </w:rPr>
-              <w:t>6</w:t>
+              <w:t>4</w:t>
             </w:r>
           </w:p>
         </w:tc>
@@ -1304,7 +1304,7 @@
                 <w:color w:val="334155"/>
                 <w:sz w:val="17"/>
               </w:rPr>
-              <w:t>55.88%</w:t>
+              <w:t>35.00%</w:t>
             </w:r>
           </w:p>
         </w:tc>
@@ -1328,7 +1328,7 @@
                 <w:color w:val="334155"/>
                 <w:sz w:val="17"/>
               </w:rPr>
-              <w:t>76.00%</w:t>
+              <w:t>84.00%</w:t>
             </w:r>
           </w:p>
         </w:tc>
@@ -1352,7 +1352,7 @@
                 <w:color w:val="334155"/>
                 <w:sz w:val="17"/>
               </w:rPr>
-              <w:t>47.50%</w:t>
+              <w:t>32.81%</w:t>
             </w:r>
           </w:p>
         </w:tc>
@@ -1376,7 +1376,7 @@
                 <w:color w:val="334155"/>
                 <w:sz w:val="17"/>
               </w:rPr>
-              <w:t>64.41%</w:t>
+              <w:t>49.41%</w:t>
             </w:r>
           </w:p>
         </w:tc>
@@ -1428,7 +1428,7 @@
                 <w:color w:val="0F172A"/>
                 <w:sz w:val="17"/>
               </w:rPr>
-              <w:t>156</w:t>
+              <w:t>169</w:t>
             </w:r>
           </w:p>
         </w:tc>
@@ -1453,7 +1453,7 @@
                 <w:color w:val="0F172A"/>
                 <w:sz w:val="17"/>
               </w:rPr>
-              <w:t>138</w:t>
+              <w:t>166</w:t>
             </w:r>
           </w:p>
         </w:tc>
@@ -1478,7 +1478,7 @@
                 <w:color w:val="0F172A"/>
                 <w:sz w:val="17"/>
               </w:rPr>
-              <w:t>22</w:t>
+              <w:t>9</w:t>
             </w:r>
           </w:p>
         </w:tc>
@@ -1503,7 +1503,7 @@
                 <w:color w:val="0F172A"/>
                 <w:sz w:val="17"/>
               </w:rPr>
-              <w:t>53.06%</w:t>
+              <w:t>50.45%</w:t>
             </w:r>
           </w:p>
         </w:tc>
@@ -1528,7 +1528,7 @@
                 <w:color w:val="0F172A"/>
                 <w:sz w:val="17"/>
               </w:rPr>
-              <w:t>87.64%</w:t>
+              <w:t>94.94%</w:t>
             </w:r>
           </w:p>
         </w:tc>
@@ -1553,7 +1553,7 @@
                 <w:color w:val="0F172A"/>
                 <w:sz w:val="17"/>
               </w:rPr>
-              <w:t>49.37%</w:t>
+              <w:t>49.13%</w:t>
             </w:r>
           </w:p>
         </w:tc>
@@ -1578,7 +1578,7 @@
                 <w:color w:val="0F172A"/>
                 <w:sz w:val="17"/>
               </w:rPr>
-              <w:t>66.10%</w:t>
+              <w:t>65.89%</w:t>
             </w:r>
           </w:p>
         </w:tc>

</xml_diff>

<commit_message>
docs: align submission evidence with detector upgrades
</commit_message>
<xml_diff>
--- a/output/Evaluation_Strategy_and_Metrics.docx
+++ b/output/Evaluation_Strategy_and_Metrics.docx
@@ -1684,7 +1684,7 @@
           <w:color w:val="1E293B"/>
           <w:sz w:val="20"/>
         </w:rPr>
-        <w:t>Person Names — 33.93% Precision, 80.28% Recall</w:t>
+        <w:t>Person Names — 37.16% Precision, 95.77% Recall</w:t>
       </w:r>
     </w:p>
     <w:p>
@@ -1695,7 +1695,7 @@
         <w:rPr>
           <w:sz w:val="19"/>
         </w:rPr>
-        <w:t>A combination of spaCy NER, table column header extraction ('Name', 'Name of Director'), and KMP title patterns ('CEO', 'CFO', 'Technical Director') captured 57 out of 71 ground truth names. The 111 false positives in evaluation represent legitimate shareholder and vendor names appearing across unsampled document sections (e.g. historical allotments, vendor agreements), confirming robust real-world coverage beyond the benchmark sample.</w:t>
+        <w:t>A combination of spaCy NER, table column header extraction, KMP title patterns, and a deterministic n-ary slash-delimited Contact Person parser captured 68 out of 71 ground truth names. Trust, fund, promoter-group, holdings, and enterprise terms are rejected before replacement. Many benchmark false positives are legitimate names outside the sampled ground truth.</w:t>
       </w:r>
     </w:p>
     <w:p>
@@ -1708,7 +1708,7 @@
           <w:color w:val="1E293B"/>
           <w:sz w:val="20"/>
         </w:rPr>
-        <w:t>Physical Addresses — 55.88% Precision, 76.00% Recall</w:t>
+        <w:t>Physical Addresses — 35.00% Precision, 84.00% Recall</w:t>
       </w:r>
     </w:p>
     <w:p>
@@ -1719,7 +1719,7 @@
         <w:rPr>
           <w:sz w:val="19"/>
         </w:rPr>
-        <w:t>Captured 19 true positives spanning registered offices, manufacturing facilities, and directors' residential addresses. Enhanced with PIN code (6-digit) and State heuristic matching for unstructured prose paragraphs.</w:t>
+        <w:t>Captured 21 true positives spanning registered offices, manufacturing facilities, and directors' residential addresses. In addition to PIN code and State matching, the table-header DOM inspector scans every paragraph under Address, Registered Office, and Corporate Office columns. The coverage-first strategy can redact complete address cells, which is the main source of precision loss.</w:t>
       </w:r>
     </w:p>
     <w:p>
@@ -1732,7 +1732,65 @@
           <w:rFonts w:ascii="Arial" w:hAnsi="Arial"/>
           <w:color w:val="0F172A"/>
         </w:rPr>
-        <w:t>5. Architectural Decisions &amp; Tradeoffs</w:t>
+        <w:t>5. Latest Algorithmic Improvements</w:t>
+      </w:r>
+    </w:p>
+    <w:p>
+      <w:pPr>
+        <w:pStyle w:val="ListBullet"/>
+        <w:spacing w:after="80"/>
+      </w:pPr>
+      <w:r>
+        <w:rPr>
+          <w:b/>
+        </w:rPr>
+        <w:t xml:space="preserve">Multi-Entity Slash-Delimited Parser: </w:t>
+      </w:r>
+      <w:r>
+        <w:t>Parses every valid name in a Contact Person list, including arbitrary slash-separated sequences that model tokenization may miss.</w:t>
+      </w:r>
+    </w:p>
+    <w:p>
+      <w:pPr>
+        <w:pStyle w:val="ListBullet"/>
+        <w:spacing w:after="80"/>
+      </w:pPr>
+      <w:r>
+        <w:rPr>
+          <w:b/>
+        </w:rPr>
+        <w:t xml:space="preserve">Table Header DOM Address Inspector: </w:t>
+      </w:r>
+      <w:r>
+        <w:t>Identifies Address, Registered Office, and Corporate Office columns, then scans all paragraphs in their data cells. This captures multi-paragraph director residences and corporate-office details.</w:t>
+      </w:r>
+    </w:p>
+    <w:p>
+      <w:pPr>
+        <w:pStyle w:val="ListBullet"/>
+        <w:spacing w:after="80"/>
+      </w:pPr>
+      <w:r>
+        <w:rPr>
+          <w:b/>
+        </w:rPr>
+        <w:t xml:space="preserve">Trust &amp; Fund Entity Denylist: </w:t>
+      </w:r>
+      <w:r>
+        <w:t>Rejects legal/financial entity candidates containing terms such as Trust, Fund, Promoter Group, Holdings, and Enterprises before person-name replacement.</w:t>
+      </w:r>
+    </w:p>
+    <w:p>
+      <w:pPr>
+        <w:pStyle w:val="Heading1"/>
+        <w:spacing w:before="320" w:after="120"/>
+      </w:pPr>
+      <w:r>
+        <w:rPr>
+          <w:rFonts w:ascii="Arial" w:hAnsi="Arial"/>
+          <w:color w:val="0F172A"/>
+        </w:rPr>
+        <w:t>6. Architectural Decisions &amp; Tradeoffs</w:t>
       </w:r>
     </w:p>
     <w:p>

</xml_diff>